<commit_message>
agregando evidencias de Ubuntu
</commit_message>
<xml_diff>
--- a/ClaseSEPTIEMBRE2826_RESUELTO.docx
+++ b/ClaseSEPTIEMBRE2826_RESUELTO.docx
@@ -2418,7 +2418,242 @@
         <w:pStyle w:val="Heading2"/>
       </w:pPr>
       <w:r>
-        <w:t>4. Lo que aprendí</w:t>
+        <w:t>4. Evidencias reales</w:t>
+      </w:r>
+    </w:p>
+    <w:p>
+      <w:pPr>
+        <w:pStyle w:val="Heading3"/>
+      </w:pPr>
+      <w:r>
+        <w:t>4.1 Ubuntu 26.04 (WSL2): compilación del kernel 6.18.54</w:t>
+      </w:r>
+    </w:p>
+    <w:p>
+      <w:r>
+        <w:t>Lo hice en mi Ubuntu 26.04 LTS sobre WSL2, con 12 núcleos y 8 GB de RAM. Descargué el código fuente de kernel.org, partí de la configuración del kernel que estaba en uso (</w:t>
+      </w:r>
+      <w:r>
+        <w:rPr>
+          <w:rFonts w:ascii="Consolas" w:hAnsi="Consolas"/>
+          <w:sz w:val="20"/>
+        </w:rPr>
+        <w:t>/proc/config.gz</w:t>
+      </w:r>
+      <w:r>
+        <w:t xml:space="preserve">, el equivalente a copiar </w:t>
+      </w:r>
+      <w:r>
+        <w:rPr>
+          <w:rFonts w:ascii="Consolas" w:hAnsi="Consolas"/>
+          <w:sz w:val="20"/>
+        </w:rPr>
+        <w:t>/boot/config-$(uname -r)</w:t>
+      </w:r>
+      <w:r>
+        <w:t>) y compilé la imagen y los módulos.</w:t>
+      </w:r>
+    </w:p>
+    <w:p>
+      <w:r>
+        <w:rPr>
+          <w:b/>
+        </w:rPr>
+        <w:t>Kernel antes de empezar y descarga del código fuente:</w:t>
+      </w:r>
+    </w:p>
+    <w:p>
+      <w:pPr>
+        <w:shd w:val="clear" w:fill="F2F2F2"/>
+      </w:pPr>
+      <w:r>
+        <w:rPr>
+          <w:rFonts w:ascii="Consolas" w:hAnsi="Consolas"/>
+          <w:sz w:val="19"/>
+        </w:rPr>
+        <w:t>$ uname -r</w:t>
+        <w:br/>
+        <w:t>6.18.33.2-microsoft-standard-WSL2</w:t>
+        <w:br/>
+        <w:br/>
+        <w:t>$ wget linux-6.18.54.tar.xz</w:t>
+        <w:br/>
+        <w:t>2026-09-28 22:30:48 URL:https://cdn.kernel.org/pub/linux/kernel/v6.x/linux-6.18.54.tar.xz [154801608/154801608]</w:t>
+        <w:br/>
+        <w:t>-rw-r--r-- 1 sergio_gomez sergio_gomez 148M Sep 25 09:47 linux-6.18.54.tar.xz</w:t>
+      </w:r>
+    </w:p>
+    <w:p>
+      <w:r>
+        <w:rPr>
+          <w:b/>
+        </w:rPr>
+        <w:t>Configuración (`make olddefconfig`):</w:t>
+      </w:r>
+    </w:p>
+    <w:p>
+      <w:pPr>
+        <w:shd w:val="clear" w:fill="F2F2F2"/>
+      </w:pPr>
+      <w:r>
+        <w:rPr>
+          <w:rFonts w:ascii="Consolas" w:hAnsi="Consolas"/>
+          <w:sz w:val="19"/>
+        </w:rPr>
+        <w:t>#</w:t>
+        <w:br/>
+        <w:t># configuration written to .config</w:t>
+        <w:br/>
+        <w:t>#</w:t>
+      </w:r>
+    </w:p>
+    <w:p>
+      <w:r>
+        <w:rPr>
+          <w:b/>
+        </w:rPr>
+        <w:t>Compilación (`make -j12 bzImage modules`):</w:t>
+      </w:r>
+      <w:r>
+        <w:t xml:space="preserve"> terminó sin errores.</w:t>
+      </w:r>
+    </w:p>
+    <w:p>
+      <w:pPr>
+        <w:shd w:val="clear" w:fill="F2F2F2"/>
+      </w:pPr>
+      <w:r>
+        <w:rPr>
+          <w:rFonts w:ascii="Consolas" w:hAnsi="Consolas"/>
+          <w:sz w:val="19"/>
+        </w:rPr>
+        <w:t>real    30m50.256s</w:t>
+        <w:br/>
+        <w:t>user    293m32.196s</w:t>
+        <w:br/>
+        <w:t>sys     54m55.183s</w:t>
+      </w:r>
+    </w:p>
+    <w:p>
+      <w:r>
+        <w:rPr>
+          <w:b/>
+        </w:rPr>
+        <w:t>Resultado:</w:t>
+      </w:r>
+    </w:p>
+    <w:p>
+      <w:pPr>
+        <w:shd w:val="clear" w:fill="F2F2F2"/>
+      </w:pPr>
+      <w:r>
+        <w:rPr>
+          <w:rFonts w:ascii="Consolas" w:hAnsi="Consolas"/>
+          <w:sz w:val="19"/>
+        </w:rPr>
+        <w:t>$ make kernelrelease</w:t>
+        <w:br/>
+        <w:t>6.18.54-microsoft-standard-WSL2</w:t>
+        <w:br/>
+        <w:br/>
+        <w:t>$ ls -lh arch/x86/boot/bzImage</w:t>
+        <w:br/>
+        <w:t>-rw-r--r-- 1 sergio_gomez sergio_gomez 15M Sep 28 23:01 arch/x86/boot/bzImage</w:t>
+        <w:br/>
+        <w:br/>
+        <w:t>$ file arch/x86/boot/bzImage</w:t>
+        <w:br/>
+        <w:t>arch/x86/boot/bzImage: Linux kernel x86 boot executable, bzImage, version 6.18.54-microsoft-standard-WSL2 (sergio_gomez@DESKTOP-8T2JB98) #1 SMP PREEMPT_DYNAMIC Mon Sep 28 22:59:50 -05 2026</w:t>
+        <w:br/>
+        <w:br/>
+        <w:t>$ find . -name "*.ko" | wc -l</w:t>
+        <w:br/>
+        <w:t>960</w:t>
+        <w:br/>
+        <w:br/>
+        <w:t>$ make modules_install INSTALL_MOD_PATH=~/kernel/rootfs</w:t>
+        <w:br/>
+        <w:t>rc=0</w:t>
+        <w:br/>
+        <w:t>6.18.54-microsoft-standard-WSL2</w:t>
+        <w:br/>
+        <w:br/>
+        <w:t>$ modinfo .../kernel/net/nsh/nsh.ko</w:t>
+        <w:br/>
+        <w:t>license:        GPL v2</w:t>
+        <w:br/>
+        <w:t>description:    NSH protocol</w:t>
+        <w:br/>
+        <w:t>author:         Jiri Benc &lt;jbenc@redhat.com&gt;</w:t>
+        <w:br/>
+        <w:t>intree:         Y</w:t>
+      </w:r>
+    </w:p>
+    <w:p>
+      <w:r>
+        <w:t>Del resultado saco tres cosas:</w:t>
+      </w:r>
+    </w:p>
+    <w:p>
+      <w:pPr>
+        <w:pStyle w:val="ListBullet"/>
+      </w:pPr>
+      <w:r>
+        <w:t>El kernel nuevo (6.18.54) es un parche más nuevo del que estaba corriendo (6.18.33.2).</w:t>
+      </w:r>
+    </w:p>
+    <w:p>
+      <w:pPr>
+        <w:pStyle w:val="ListBullet"/>
+      </w:pPr>
+      <w:r>
+        <w:t xml:space="preserve">La imagen </w:t>
+      </w:r>
+      <w:r>
+        <w:rPr>
+          <w:rFonts w:ascii="Consolas" w:hAnsi="Consolas"/>
+          <w:sz w:val="20"/>
+        </w:rPr>
+        <w:t>bzImage</w:t>
+      </w:r>
+      <w:r>
+        <w:t xml:space="preserve"> pesa 15 MB, y los componentes que no van dentro se compilaron como 960 módulos </w:t>
+      </w:r>
+      <w:r>
+        <w:rPr>
+          <w:rFonts w:ascii="Consolas" w:hAnsi="Consolas"/>
+          <w:sz w:val="20"/>
+        </w:rPr>
+        <w:t>.ko</w:t>
+      </w:r>
+      <w:r>
+        <w:t>, tal como explica la diapositiva 34.</w:t>
+      </w:r>
+    </w:p>
+    <w:p>
+      <w:pPr>
+        <w:pStyle w:val="ListBullet"/>
+      </w:pPr>
+      <w:r>
+        <w:t xml:space="preserve">WSL2 arranca el kernel desde Windows y no desde GRUB, así que el paso </w:t>
+      </w:r>
+      <w:r>
+        <w:rPr>
+          <w:rFonts w:ascii="Consolas" w:hAnsi="Consolas"/>
+          <w:sz w:val="20"/>
+        </w:rPr>
+        <w:t>update-grub</w:t>
+      </w:r>
+      <w:r>
+        <w:t xml:space="preserve"> y el reinicio no aplican ahí. En una instalación normal de Ubuntu ese último paso es el que activa el kernel nuevo.</w:t>
+      </w:r>
+    </w:p>
+    <w:p>
+      <w:pPr>
+        <w:pStyle w:val="Heading2"/>
+      </w:pPr>
+      <w:r>
+        <w:t>5. Lo que aprendí</w:t>
       </w:r>
     </w:p>
     <w:p>

</xml_diff>

<commit_message>
agregando evidencias de FreeBSD
</commit_message>
<xml_diff>
--- a/ClaseSEPTIEMBRE2826_RESUELTO.docx
+++ b/ClaseSEPTIEMBRE2826_RESUELTO.docx
@@ -990,6 +990,75 @@
       </w:r>
     </w:p>
     <w:p>
+      <w:r>
+        <w:rPr>
+          <w:b/>
+        </w:rPr>
+        <w:t>Cosa que descubrí al hacerlo de verdad:</w:t>
+      </w:r>
+      <w:r>
+        <w:t xml:space="preserve"> en FreeBSD 15.1 el kernel que viene instalado es de paquetes (pkgbase), y </w:t>
+      </w:r>
+      <w:r>
+        <w:rPr>
+          <w:rFonts w:ascii="Consolas" w:hAnsi="Consolas"/>
+          <w:sz w:val="20"/>
+        </w:rPr>
+        <w:t>make installkernel</w:t>
+      </w:r>
+      <w:r>
+        <w:t xml:space="preserve"> se niega a pisarlo y da error. La solución es instalar el kernel nuevo en otra ruta con </w:t>
+      </w:r>
+      <w:r>
+        <w:rPr>
+          <w:rFonts w:ascii="Consolas" w:hAnsi="Consolas"/>
+          <w:sz w:val="20"/>
+        </w:rPr>
+        <w:t>INSTKERNNAME</w:t>
+      </w:r>
+      <w:r>
+        <w:t>, y así el kernel GENERIC queda intacto como respaldo:</w:t>
+      </w:r>
+    </w:p>
+    <w:p>
+      <w:pPr>
+        <w:shd w:val="clear" w:fill="F2F2F2"/>
+      </w:pPr>
+      <w:r>
+        <w:rPr>
+          <w:rFonts w:ascii="Consolas" w:hAnsi="Consolas"/>
+          <w:sz w:val="19"/>
+        </w:rPr>
+        <w:t>make installkernel KERNCONF=CLASEKERN INSTKERNNAME=CLASEKERN</w:t>
+        <w:br/>
+        <w:t>nextboot -k CLASEKERN</w:t>
+        <w:br/>
+        <w:t>init 6</w:t>
+      </w:r>
+    </w:p>
+    <w:p>
+      <w:r>
+        <w:rPr>
+          <w:rFonts w:ascii="Consolas" w:hAnsi="Consolas"/>
+          <w:sz w:val="20"/>
+        </w:rPr>
+        <w:t>nextboot -k</w:t>
+      </w:r>
+      <w:r>
+        <w:t xml:space="preserve"> le dice al cargador que arranque </w:t>
+      </w:r>
+      <w:r>
+        <w:rPr>
+          <w:rFonts w:ascii="Consolas" w:hAnsi="Consolas"/>
+          <w:sz w:val="20"/>
+        </w:rPr>
+        <w:t>CLASEKERN</w:t>
+      </w:r>
+      <w:r>
+        <w:t xml:space="preserve"> solo en el siguiente reinicio. Si algo falla, el siguiente arranque vuelve solo al kernel GENERIC.</w:t>
+      </w:r>
+    </w:p>
+    <w:p>
       <w:pPr>
         <w:pStyle w:val="Heading3"/>
       </w:pPr>
@@ -1039,20 +1108,20 @@
           <w:rFonts w:ascii="Consolas" w:hAnsi="Consolas"/>
           <w:sz w:val="20"/>
         </w:rPr>
-        <w:t>-k</w:t>
-      </w:r>
-      <w:r>
-        <w:t xml:space="preserve"> y </w:t>
+        <w:t>sysctl kern.bootfile</w:t>
+      </w:r>
+      <w:r>
+        <w:t xml:space="preserve"> debería apuntar a </w:t>
       </w:r>
       <w:r>
         <w:rPr>
           <w:rFonts w:ascii="Consolas" w:hAnsi="Consolas"/>
           <w:sz w:val="20"/>
         </w:rPr>
-        <w:t>-r</w:t>
-      </w:r>
-      <w:r>
-        <w:t xml:space="preserve"> deberían coincidir.</w:t>
+        <w:t>/boot/CLASEKERN/kernel</w:t>
+      </w:r>
+      <w:r>
+        <w:t>.</w:t>
       </w:r>
     </w:p>
     <w:p>
@@ -1066,7 +1135,7 @@
         <w:t>Si falla el arranque:</w:t>
       </w:r>
       <w:r>
-        <w:t xml:space="preserve"> en el menú de arranque de FreeBSD se elige </w:t>
+        <w:t xml:space="preserve"> en el menú de arranque de FreeBSD se puede elegir otro kernel para volver al anterior (</w:t>
       </w:r>
       <w:r>
         <w:rPr>
@@ -1076,17 +1145,27 @@
         <w:t>kernel.old</w:t>
       </w:r>
       <w:r>
-        <w:t xml:space="preserve"> para volver al kernel anterior. Por eso </w:t>
+        <w:t xml:space="preserve"> en una instalación clásica, o </w:t>
       </w:r>
       <w:r>
         <w:rPr>
           <w:rFonts w:ascii="Consolas" w:hAnsi="Consolas"/>
           <w:sz w:val="20"/>
         </w:rPr>
-        <w:t>installkernel</w:t>
-      </w:r>
-      <w:r>
-        <w:t xml:space="preserve"> guarda esa copia.</w:t>
+        <w:t>kernel</w:t>
+      </w:r>
+      <w:r>
+        <w:t xml:space="preserve"> cuando se usó </w:t>
+      </w:r>
+      <w:r>
+        <w:rPr>
+          <w:rFonts w:ascii="Consolas" w:hAnsi="Consolas"/>
+          <w:sz w:val="20"/>
+        </w:rPr>
+        <w:t>INSTKERNNAME</w:t>
+      </w:r>
+      <w:r>
+        <w:t>).</w:t>
       </w:r>
     </w:p>
     <w:p>
@@ -2646,6 +2725,364 @@
       </w:r>
       <w:r>
         <w:t xml:space="preserve"> y el reinicio no aplican ahí. En una instalación normal de Ubuntu ese último paso es el que activa el kernel nuevo.</w:t>
+      </w:r>
+    </w:p>
+    <w:p>
+      <w:pPr>
+        <w:pStyle w:val="Heading3"/>
+      </w:pPr>
+      <w:r>
+        <w:t>4.2 FreeBSD 15.1: kernel personalizado CLASEKERN</w:t>
+      </w:r>
+    </w:p>
+    <w:p>
+      <w:r>
+        <w:t>Usé la máquina virtual de FreeBSD 15.1-RELEASE (amd64) en VirtualBox, con 6 CPU y 4 GB de RAM. Ampliué el disco a 30 GB porque el original de 6 GB no alcanzaba para el código fuente y la compilación, y descargué las fuentes (</w:t>
+      </w:r>
+      <w:r>
+        <w:rPr>
+          <w:rFonts w:ascii="Consolas" w:hAnsi="Consolas"/>
+          <w:sz w:val="20"/>
+        </w:rPr>
+        <w:t>src.txz</w:t>
+      </w:r>
+      <w:r>
+        <w:t xml:space="preserve">, 241 MB) con </w:t>
+      </w:r>
+      <w:r>
+        <w:rPr>
+          <w:rFonts w:ascii="Consolas" w:hAnsi="Consolas"/>
+          <w:sz w:val="20"/>
+        </w:rPr>
+        <w:t>fetch</w:t>
+      </w:r>
+      <w:r>
+        <w:t xml:space="preserve"> desde download.freebsd.org. Como el sistema es de 64 bits, la ruta de configuración es </w:t>
+      </w:r>
+      <w:r>
+        <w:rPr>
+          <w:rFonts w:ascii="Consolas" w:hAnsi="Consolas"/>
+          <w:sz w:val="20"/>
+        </w:rPr>
+        <w:t>amd64</w:t>
+      </w:r>
+      <w:r>
+        <w:t xml:space="preserve"> y no </w:t>
+      </w:r>
+      <w:r>
+        <w:rPr>
+          <w:rFonts w:ascii="Consolas" w:hAnsi="Consolas"/>
+          <w:sz w:val="20"/>
+        </w:rPr>
+        <w:t>i386</w:t>
+      </w:r>
+      <w:r>
+        <w:t>.</w:t>
+      </w:r>
+    </w:p>
+    <w:p>
+      <w:r>
+        <w:rPr>
+          <w:b/>
+        </w:rPr>
+        <w:t>Identificar el sistema:</w:t>
+      </w:r>
+    </w:p>
+    <w:p>
+      <w:pPr>
+        <w:shd w:val="clear" w:fill="F2F2F2"/>
+      </w:pPr>
+      <w:r>
+        <w:rPr>
+          <w:rFonts w:ascii="Consolas" w:hAnsi="Consolas"/>
+          <w:sz w:val="19"/>
+        </w:rPr>
+        <w:t># cat /etc/os-release</w:t>
+        <w:br/>
+        <w:t>NAME=FreeBSD</w:t>
+        <w:br/>
+        <w:t>VERSION="15.1-RELEASE"</w:t>
+        <w:br/>
+        <w:t>VERSION_ID="15.1"</w:t>
+        <w:br/>
+        <w:t>ID=freebsd</w:t>
+        <w:br/>
+        <w:t># freebsd-version -u -k -r</w:t>
+        <w:br/>
+        <w:t>15.1-RELEASE</w:t>
+        <w:br/>
+        <w:t>15.1-RELEASE</w:t>
+        <w:br/>
+        <w:t>15.1-RELEASE</w:t>
+        <w:br/>
+        <w:t># getconf LONG_BIT</w:t>
+        <w:br/>
+        <w:t>64</w:t>
+        <w:br/>
+        <w:t># uname -a</w:t>
+        <w:br/>
+        <w:t>FreeBSD freebsd 15.1-RELEASE FreeBSD 15.1-RELEASE releng/15.1-n283562-96841ea08dcf GENERIC amd64</w:t>
+      </w:r>
+    </w:p>
+    <w:p>
+      <w:r>
+        <w:rPr>
+          <w:b/>
+        </w:rPr>
+        <w:t>Configurar el kernel</w:t>
+      </w:r>
+      <w:r>
+        <w:t xml:space="preserve"> (cambié la línea </w:t>
+      </w:r>
+      <w:r>
+        <w:rPr>
+          <w:rFonts w:ascii="Consolas" w:hAnsi="Consolas"/>
+          <w:sz w:val="20"/>
+        </w:rPr>
+        <w:t>ident</w:t>
+      </w:r>
+      <w:r>
+        <w:t xml:space="preserve"> a </w:t>
+      </w:r>
+      <w:r>
+        <w:rPr>
+          <w:rFonts w:ascii="Consolas" w:hAnsi="Consolas"/>
+          <w:sz w:val="20"/>
+        </w:rPr>
+        <w:t>CLASEKERN</w:t>
+      </w:r>
+      <w:r>
+        <w:t xml:space="preserve"> para poder reconocerlo después):</w:t>
+      </w:r>
+    </w:p>
+    <w:p>
+      <w:pPr>
+        <w:shd w:val="clear" w:fill="F2F2F2"/>
+      </w:pPr>
+      <w:r>
+        <w:rPr>
+          <w:rFonts w:ascii="Consolas" w:hAnsi="Consolas"/>
+          <w:sz w:val="19"/>
+        </w:rPr>
+        <w:t># cd /usr/src/sys/amd64/conf</w:t>
+        <w:br/>
+        <w:t># mkdir /root/kernels</w:t>
+        <w:br/>
+        <w:t># cp GENERIC /root/kernels/CLASEKERN</w:t>
+        <w:br/>
+        <w:t># ln -s /root/kernels/CLASEKERN</w:t>
+        <w:br/>
+        <w:t>lrwxr-xr-x  1 root wheel 23 Sep 28 23:16 CLASEKERN -&gt; /root/kernels/CLASEKERN</w:t>
+        <w:br/>
+        <w:t># grep ident CLASEKERN</w:t>
+        <w:br/>
+        <w:t>ident</w:t>
+        <w:tab/>
+        <w:tab/>
+        <w:t>CLASEKERN</w:t>
+      </w:r>
+    </w:p>
+    <w:p>
+      <w:r>
+        <w:rPr>
+          <w:b/>
+        </w:rPr>
+        <w:t>Compilar</w:t>
+      </w:r>
+      <w:r>
+        <w:t xml:space="preserve"> (</w:t>
+      </w:r>
+      <w:r>
+        <w:rPr>
+          <w:rFonts w:ascii="Consolas" w:hAnsi="Consolas"/>
+          <w:sz w:val="20"/>
+        </w:rPr>
+        <w:t>make -j6 buildkernel KERNCONF=CLASEKERN</w:t>
+      </w:r>
+      <w:r>
+        <w:t xml:space="preserve">, desde </w:t>
+      </w:r>
+      <w:r>
+        <w:rPr>
+          <w:rFonts w:ascii="Consolas" w:hAnsi="Consolas"/>
+          <w:sz w:val="20"/>
+        </w:rPr>
+        <w:t>/usr/src</w:t>
+      </w:r>
+      <w:r>
+        <w:t>):</w:t>
+      </w:r>
+    </w:p>
+    <w:p>
+      <w:pPr>
+        <w:shd w:val="clear" w:fill="F2F2F2"/>
+      </w:pPr>
+      <w:r>
+        <w:rPr>
+          <w:rFonts w:ascii="Consolas" w:hAnsi="Consolas"/>
+          <w:sz w:val="19"/>
+        </w:rPr>
+        <w:t>&gt;&gt;&gt; Kernel(s)  CLASEKERN built in 3924 seconds, ncpu: 6, make -j6</w:t>
+        <w:br/>
+        <w:t xml:space="preserve">     3933.05 real     17756.49 user      4551.05 sys</w:t>
+      </w:r>
+    </w:p>
+    <w:p>
+      <w:r>
+        <w:rPr>
+          <w:b/>
+        </w:rPr>
+        <w:t>Primer intento de instalar</w:t>
+      </w:r>
+      <w:r>
+        <w:t xml:space="preserve"> (</w:t>
+      </w:r>
+      <w:r>
+        <w:rPr>
+          <w:rFonts w:ascii="Consolas" w:hAnsi="Consolas"/>
+          <w:sz w:val="20"/>
+        </w:rPr>
+        <w:t>make installkernel KERNCONF=CLASEKERN</w:t>
+      </w:r>
+      <w:r>
+        <w:t>), que falló:</w:t>
+      </w:r>
+    </w:p>
+    <w:p>
+      <w:pPr>
+        <w:shd w:val="clear" w:fill="F2F2F2"/>
+      </w:pPr>
+      <w:r>
+        <w:rPr>
+          <w:rFonts w:ascii="Consolas" w:hAnsi="Consolas"/>
+          <w:sz w:val="19"/>
+        </w:rPr>
+        <w:t>ERROR: The kernel at /boot/kernel was installed from packages.</w:t>
+        <w:br/>
+        <w:t xml:space="preserve">       A packaged kernel should never be updated using installkernel;</w:t>
+        <w:br/>
+        <w:t xml:space="preserve">       this will cause the package database to become out of sync with</w:t>
+        <w:br/>
+        <w:t xml:space="preserve">       the live system state.  Either uninstall the packaged kernel,</w:t>
+        <w:br/>
+        <w:t xml:space="preserve">       or install this kernel to a different path using INSTKERNNAME.</w:t>
+      </w:r>
+    </w:p>
+    <w:p>
+      <w:r>
+        <w:rPr>
+          <w:b/>
+        </w:rPr>
+        <w:t>Instalación en otra ruta y arranque:</w:t>
+      </w:r>
+    </w:p>
+    <w:p>
+      <w:pPr>
+        <w:shd w:val="clear" w:fill="F2F2F2"/>
+      </w:pPr>
+      <w:r>
+        <w:rPr>
+          <w:rFonts w:ascii="Consolas" w:hAnsi="Consolas"/>
+          <w:sz w:val="19"/>
+        </w:rPr>
+        <w:t># make installkernel KERNCONF=CLASEKERN INSTKERNNAME=CLASEKERN</w:t>
+        <w:br/>
+        <w:t>&gt;&gt;&gt; Install kernel(s) CLASEKERN completed in 221 seconds, ncpu: 6</w:t>
+        <w:br/>
+        <w:t># ls -lh /boot/CLASEKERN/kernel</w:t>
+        <w:br/>
+        <w:t>-r--r--r--  1 root wheel   28M Sep 29 00:21 /boot/CLASEKERN/kernel</w:t>
+        <w:br/>
+        <w:t># nextboot -k CLASEKERN</w:t>
+        <w:br/>
+        <w:t># init 6</w:t>
+      </w:r>
+    </w:p>
+    <w:p>
+      <w:r>
+        <w:rPr>
+          <w:b/>
+        </w:rPr>
+        <w:t>Después de reiniciar:</w:t>
+      </w:r>
+    </w:p>
+    <w:p>
+      <w:pPr>
+        <w:shd w:val="clear" w:fill="F2F2F2"/>
+      </w:pPr>
+      <w:r>
+        <w:rPr>
+          <w:rFonts w:ascii="Consolas" w:hAnsi="Consolas"/>
+          <w:sz w:val="19"/>
+        </w:rPr>
+        <w:t># uname -a</w:t>
+        <w:br/>
+        <w:t>FreeBSD freebsd 15.1-RELEASE FreeBSD 15.1-RELEASE CLASEKERN amd64</w:t>
+        <w:br/>
+        <w:t># uname -i</w:t>
+        <w:br/>
+        <w:t>CLASEKERN</w:t>
+        <w:br/>
+        <w:t># sysctl kern.bootfile</w:t>
+        <w:br/>
+        <w:t>kern.bootfile: /boot/CLASEKERN/kernel</w:t>
+        <w:br/>
+        <w:t># sysctl kern.ident</w:t>
+        <w:br/>
+        <w:t>kern.ident: CLASEKERN</w:t>
+        <w:br/>
+        <w:t># kldstat | head -3</w:t>
+        <w:br/>
+        <w:t>Id Refs Address                Size Name</w:t>
+        <w:br/>
+        <w:t xml:space="preserve"> 1    5 0xffffffff80200000  22fb980 kernel</w:t>
+        <w:br/>
+        <w:t xml:space="preserve"> 2    1 0xffffffff82c18000     3220 intpm.ko</w:t>
+      </w:r>
+    </w:p>
+    <w:p>
+      <w:r>
+        <w:t xml:space="preserve">Con esto queda comprobado que el sistema arrancó con mi kernel </w:t>
+      </w:r>
+      <w:r>
+        <w:rPr>
+          <w:rFonts w:ascii="Consolas" w:hAnsi="Consolas"/>
+          <w:sz w:val="20"/>
+        </w:rPr>
+        <w:t>CLASEKERN</w:t>
+      </w:r>
+      <w:r>
+        <w:t xml:space="preserve">. Antes decía </w:t>
+      </w:r>
+      <w:r>
+        <w:rPr>
+          <w:rFonts w:ascii="Consolas" w:hAnsi="Consolas"/>
+          <w:sz w:val="20"/>
+        </w:rPr>
+        <w:t>GENERIC</w:t>
+      </w:r>
+      <w:r>
+        <w:t xml:space="preserve"> al final de </w:t>
+      </w:r>
+      <w:r>
+        <w:rPr>
+          <w:rFonts w:ascii="Consolas" w:hAnsi="Consolas"/>
+          <w:sz w:val="20"/>
+        </w:rPr>
+        <w:t>uname -a</w:t>
+      </w:r>
+      <w:r>
+        <w:t xml:space="preserve"> y ahora dice </w:t>
+      </w:r>
+      <w:r>
+        <w:rPr>
+          <w:rFonts w:ascii="Consolas" w:hAnsi="Consolas"/>
+          <w:sz w:val="20"/>
+        </w:rPr>
+        <w:t>CLASEKERN</w:t>
+      </w:r>
+      <w:r>
+        <w:t>. La compilación tardó más de una hora aun con 6 CPU, lo que confirma lo que decía la diapositiva 35 sobre que compilar un kernel lleva su tiempo.</w:t>
       </w:r>
     </w:p>
     <w:p>

</xml_diff>

<commit_message>
ajustando imagenes y entorno
</commit_message>
<xml_diff>
--- a/ClaseSEPTIEMBRE2826_RESUELTO.docx
+++ b/ClaseSEPTIEMBRE2826_RESUELTO.docx
@@ -2501,6 +2501,44 @@
       </w:r>
     </w:p>
     <w:p>
+      <w:r>
+        <w:rPr>
+          <w:b/>
+        </w:rPr>
+        <w:t>Entorno de trabajo:</w:t>
+      </w:r>
+      <w:r>
+        <w:t xml:space="preserve"> todas las pruebas las hice en mi computador con </w:t>
+      </w:r>
+      <w:r>
+        <w:rPr>
+          <w:b/>
+        </w:rPr>
+        <w:t>Windows 11</w:t>
+      </w:r>
+      <w:r>
+        <w:t xml:space="preserve">. Para la parte de Linux usé </w:t>
+      </w:r>
+      <w:r>
+        <w:rPr>
+          <w:b/>
+        </w:rPr>
+        <w:t>Ubuntu 26.04 LTS sobre WSL2</w:t>
+      </w:r>
+      <w:r>
+        <w:t xml:space="preserve">, y para la parte de FreeBSD usé una </w:t>
+      </w:r>
+      <w:r>
+        <w:rPr>
+          <w:b/>
+        </w:rPr>
+        <w:t>máquina virtual de FreeBSD 15.1 en VirtualBox</w:t>
+      </w:r>
+      <w:r>
+        <w:t>. Las imágenes de esta sección son capturas de las salidas reales de la terminal de esos dos entornos. Mac OS X aparece en este documento solo como ejemplo teórico de kernel híbrido (sección 3) y no participó en ninguna prueba.</w:t>
+      </w:r>
+    </w:p>
+    <w:p>
       <w:pPr>
         <w:pStyle w:val="Heading3"/>
       </w:pPr>
@@ -2510,7 +2548,7 @@
     </w:p>
     <w:p>
       <w:r>
-        <w:t>Lo hice en mi Ubuntu 26.04 LTS sobre WSL2, con 12 núcleos y 8 GB de RAM. Descargué el código fuente de kernel.org, partí de la configuración del kernel que estaba en uso (</w:t>
+        <w:t>Lo hice en Ubuntu 26.04 LTS ejecutándose sobre WSL2 dentro de mi Windows 11, con 12 núcleos y 8 GB de RAM disponibles. Descargué el código fuente de kernel.org, partí de la configuración del kernel que estaba en uso (</w:t>
       </w:r>
       <w:r>
         <w:rPr>
@@ -2548,7 +2586,7 @@
       <w:r>
         <w:drawing>
           <wp:inline xmlns:a="http://schemas.openxmlformats.org/drawingml/2006/main" xmlns:pic="http://schemas.openxmlformats.org/drawingml/2006/picture">
-            <wp:extent cx="5760720" cy="1414914"/>
+            <wp:extent cx="5760720" cy="1243103"/>
             <wp:docPr id="1" name="Picture 1"/>
             <wp:cNvGraphicFramePr>
               <a:graphicFrameLocks noChangeAspect="1"/>
@@ -2569,7 +2607,7 @@
                   <pic:spPr>
                     <a:xfrm>
                       <a:off x="0" y="0"/>
-                      <a:ext cx="5760720" cy="1414914"/>
+                      <a:ext cx="5760720" cy="1243103"/>
                     </a:xfrm>
                     <a:prstGeom prst="rect"/>
                   </pic:spPr>
@@ -2595,7 +2633,7 @@
       <w:r>
         <w:drawing>
           <wp:inline xmlns:a="http://schemas.openxmlformats.org/drawingml/2006/main" xmlns:pic="http://schemas.openxmlformats.org/drawingml/2006/picture">
-            <wp:extent cx="5760720" cy="808522"/>
+            <wp:extent cx="5760720" cy="636711"/>
             <wp:docPr id="2" name="Picture 2"/>
             <wp:cNvGraphicFramePr>
               <a:graphicFrameLocks noChangeAspect="1"/>
@@ -2616,7 +2654,7 @@
                   <pic:spPr>
                     <a:xfrm>
                       <a:off x="0" y="0"/>
-                      <a:ext cx="5760720" cy="808522"/>
+                      <a:ext cx="5760720" cy="636711"/>
                     </a:xfrm>
                     <a:prstGeom prst="rect"/>
                   </pic:spPr>
@@ -2645,7 +2683,7 @@
       <w:r>
         <w:drawing>
           <wp:inline xmlns:a="http://schemas.openxmlformats.org/drawingml/2006/main" xmlns:pic="http://schemas.openxmlformats.org/drawingml/2006/picture">
-            <wp:extent cx="5760720" cy="808522"/>
+            <wp:extent cx="5760720" cy="636711"/>
             <wp:docPr id="3" name="Picture 3"/>
             <wp:cNvGraphicFramePr>
               <a:graphicFrameLocks noChangeAspect="1"/>
@@ -2666,7 +2704,7 @@
                   <pic:spPr>
                     <a:xfrm>
                       <a:off x="0" y="0"/>
-                      <a:ext cx="5760720" cy="808522"/>
+                      <a:ext cx="5760720" cy="636711"/>
                     </a:xfrm>
                     <a:prstGeom prst="rect"/>
                   </pic:spPr>
@@ -2692,7 +2730,7 @@
       <w:r>
         <w:drawing>
           <wp:inline xmlns:a="http://schemas.openxmlformats.org/drawingml/2006/main" xmlns:pic="http://schemas.openxmlformats.org/drawingml/2006/picture">
-            <wp:extent cx="5760720" cy="3840480"/>
+            <wp:extent cx="5760720" cy="3668669"/>
             <wp:docPr id="4" name="Picture 4"/>
             <wp:cNvGraphicFramePr>
               <a:graphicFrameLocks noChangeAspect="1"/>
@@ -2713,7 +2751,7 @@
                   <pic:spPr>
                     <a:xfrm>
                       <a:off x="0" y="0"/>
-                      <a:ext cx="5760720" cy="3840480"/>
+                      <a:ext cx="5760720" cy="3668669"/>
                     </a:xfrm>
                     <a:prstGeom prst="rect"/>
                   </pic:spPr>
@@ -2793,7 +2831,7 @@
     </w:p>
     <w:p>
       <w:r>
-        <w:t>Usé la máquina virtual de FreeBSD 15.1-RELEASE (amd64) en VirtualBox, con 6 CPU y 4 GB de RAM. Ampliué el disco a 30 GB porque el original de 6 GB no alcanzaba para el código fuente y la compilación, y descargué las fuentes (</w:t>
+        <w:t>Usé la máquina virtual de FreeBSD 15.1-RELEASE (amd64) que corre en VirtualBox sobre mi Windows 11, con 6 CPU y 4 GB de RAM, y trabajé con ella por SSH desde Windows. Ampliué el disco a 30 GB porque el original de 6 GB no alcanzaba para el código fuente y la compilación, y descargué las fuentes (</w:t>
       </w:r>
       <w:r>
         <w:rPr>
@@ -2851,7 +2889,7 @@
       <w:r>
         <w:drawing>
           <wp:inline xmlns:a="http://schemas.openxmlformats.org/drawingml/2006/main" xmlns:pic="http://schemas.openxmlformats.org/drawingml/2006/picture">
-            <wp:extent cx="5760720" cy="2476099"/>
+            <wp:extent cx="5760720" cy="2304288"/>
             <wp:docPr id="5" name="Picture 5"/>
             <wp:cNvGraphicFramePr>
               <a:graphicFrameLocks noChangeAspect="1"/>
@@ -2872,7 +2910,7 @@
                   <pic:spPr>
                     <a:xfrm>
                       <a:off x="0" y="0"/>
-                      <a:ext cx="5760720" cy="2476099"/>
+                      <a:ext cx="5760720" cy="2304288"/>
                     </a:xfrm>
                     <a:prstGeom prst="rect"/>
                   </pic:spPr>
@@ -2921,7 +2959,7 @@
       <w:r>
         <w:drawing>
           <wp:inline xmlns:a="http://schemas.openxmlformats.org/drawingml/2006/main" xmlns:pic="http://schemas.openxmlformats.org/drawingml/2006/picture">
-            <wp:extent cx="5760720" cy="1414914"/>
+            <wp:extent cx="5760720" cy="1243103"/>
             <wp:docPr id="6" name="Picture 6"/>
             <wp:cNvGraphicFramePr>
               <a:graphicFrameLocks noChangeAspect="1"/>
@@ -2942,7 +2980,7 @@
                   <pic:spPr>
                     <a:xfrm>
                       <a:off x="0" y="0"/>
-                      <a:ext cx="5760720" cy="1414914"/>
+                      <a:ext cx="5760720" cy="1243103"/>
                     </a:xfrm>
                     <a:prstGeom prst="rect"/>
                   </pic:spPr>
@@ -2991,7 +3029,7 @@
       <w:r>
         <w:drawing>
           <wp:inline xmlns:a="http://schemas.openxmlformats.org/drawingml/2006/main" xmlns:pic="http://schemas.openxmlformats.org/drawingml/2006/picture">
-            <wp:extent cx="5760720" cy="656924"/>
+            <wp:extent cx="5760720" cy="485113"/>
             <wp:docPr id="7" name="Picture 7"/>
             <wp:cNvGraphicFramePr>
               <a:graphicFrameLocks noChangeAspect="1"/>
@@ -3012,7 +3050,7 @@
                   <pic:spPr>
                     <a:xfrm>
                       <a:off x="0" y="0"/>
-                      <a:ext cx="5760720" cy="656924"/>
+                      <a:ext cx="5760720" cy="485113"/>
                     </a:xfrm>
                     <a:prstGeom prst="rect"/>
                   </pic:spPr>
@@ -3051,7 +3089,7 @@
       <w:r>
         <w:drawing>
           <wp:inline xmlns:a="http://schemas.openxmlformats.org/drawingml/2006/main" xmlns:pic="http://schemas.openxmlformats.org/drawingml/2006/picture">
-            <wp:extent cx="5760720" cy="1111718"/>
+            <wp:extent cx="5760720" cy="939907"/>
             <wp:docPr id="8" name="Picture 8"/>
             <wp:cNvGraphicFramePr>
               <a:graphicFrameLocks noChangeAspect="1"/>
@@ -3072,7 +3110,7 @@
                   <pic:spPr>
                     <a:xfrm>
                       <a:off x="0" y="0"/>
-                      <a:ext cx="5760720" cy="1111718"/>
+                      <a:ext cx="5760720" cy="939907"/>
                     </a:xfrm>
                     <a:prstGeom prst="rect"/>
                   </pic:spPr>
@@ -3098,7 +3136,7 @@
       <w:r>
         <w:drawing>
           <wp:inline xmlns:a="http://schemas.openxmlformats.org/drawingml/2006/main" xmlns:pic="http://schemas.openxmlformats.org/drawingml/2006/picture">
-            <wp:extent cx="5760720" cy="1263316"/>
+            <wp:extent cx="5760720" cy="1091505"/>
             <wp:docPr id="9" name="Picture 9"/>
             <wp:cNvGraphicFramePr>
               <a:graphicFrameLocks noChangeAspect="1"/>
@@ -3119,7 +3157,7 @@
                   <pic:spPr>
                     <a:xfrm>
                       <a:off x="0" y="0"/>
-                      <a:ext cx="5760720" cy="1263316"/>
+                      <a:ext cx="5760720" cy="1091505"/>
                     </a:xfrm>
                     <a:prstGeom prst="rect"/>
                   </pic:spPr>
@@ -3145,7 +3183,7 @@
       <w:r>
         <w:drawing>
           <wp:inline xmlns:a="http://schemas.openxmlformats.org/drawingml/2006/main" xmlns:pic="http://schemas.openxmlformats.org/drawingml/2006/picture">
-            <wp:extent cx="5760720" cy="2172903"/>
+            <wp:extent cx="5760720" cy="2001092"/>
             <wp:docPr id="10" name="Picture 10"/>
             <wp:cNvGraphicFramePr>
               <a:graphicFrameLocks noChangeAspect="1"/>
@@ -3166,7 +3204,7 @@
                   <pic:spPr>
                     <a:xfrm>
                       <a:off x="0" y="0"/>
-                      <a:ext cx="5760720" cy="2172903"/>
+                      <a:ext cx="5760720" cy="2001092"/>
                     </a:xfrm>
                     <a:prstGeom prst="rect"/>
                   </pic:spPr>

</xml_diff>